<commit_message>
Data room paper: remove the Gambichler citation
Scott's call. The cited paper measures opioid peptides and does not mention
serotonin, verified against Europe PMC (PMID 12452872), so it did not survive
anyone opening it.

Leaves the UVA-triggered serotonin heading carrying one reference, Kaur 2019,
which concerns serotonin's role in seasonal affective disorder rather than UVA
producing serotonin. Flagged to Scott: the heading now claims more than the
citation beneath it establishes, which is a smaller version of the problem just
removed.

Co-Authored-By: Claude Opus 5 <noreply@anthropic.com>
</commit_message>
<xml_diff>
--- a/Enyrgy_Story_and_Clinical_Data.docx
+++ b/Enyrgy_Story_and_Clinical_Data.docx
@@ -396,31 +396,6 @@
           <w:bCs/>
         </w:rPr>
         <w:t xml:space="preserve">UVA-triggered serotonin production</w:t>
-      </w:r>
-    </w:p>
-    <w:p>
-      <w:pPr>
-        <w:pStyle w:val="Compact"/>
-        <w:numPr>
-          <w:ilvl w:val="0"/>
-          <w:numId w:val="1003"/>
-        </w:numPr>
-      </w:pPr>
-      <w:r>
-        <w:t xml:space="preserve">Gambichler, T., et al. (2002). Plasma levels of opioid peptides after repeated exposure to ultraviolet radiation.</w:t>
-      </w:r>
-      <w:r>
-        <w:t xml:space="preserve"> </w:t>
-      </w:r>
-      <w:r>
-        <w:rPr>
-          <w:i/>
-          <w:iCs/>
-        </w:rPr>
-        <w:t xml:space="preserve">British Journal of Dermatology</w:t>
-      </w:r>
-      <w:r>
-        <w:t xml:space="preserve">, 147(6), 1207 to 1211.</w:t>
       </w:r>
     </w:p>
     <w:p>

</xml_diff>